<commit_message>
added updated code for adding payload data
</commit_message>
<xml_diff>
--- a/backend/app/tests/reports/modules/test_drone_instances_api_documentation.docx
+++ b/backend/app/tests/reports/modules/test_drone_instances_api_documentation.docx
@@ -12,17 +12,17 @@
     </w:p>
     <w:p>
       <w:r>
-        <w:t>Generated at: 2026-07-10T05:01:59+00:00</w:t>
+        <w:t>Generated at: 2026-07-13T06:11:35+00:00</w:t>
       </w:r>
     </w:p>
     <w:p>
       <w:r>
-        <w:t>Test session started: 2026-07-10T04:58:46+00:00</w:t>
+        <w:t>Test session started: 2026-07-13T06:08:37+00:00</w:t>
       </w:r>
     </w:p>
     <w:p>
       <w:r>
-        <w:t>Pytest exit status: 1</w:t>
+        <w:t>Pytest exit status: 0</w:t>
       </w:r>
     </w:p>
     <w:p>
@@ -88,29 +88,29 @@
           </w:tcPr>
           <w:p>
             <w:r>
-              <w:t>18</w:t>
-            </w:r>
-          </w:p>
-        </w:tc>
-      </w:tr>
-      <w:tr>
-        <w:tc>
-          <w:tcPr>
-            <w:tcW w:w="2400" w:type="dxa"/>
-          </w:tcPr>
-          <w:p>
-            <w:r>
-              <w:t>Passed</w:t>
-            </w:r>
-          </w:p>
-        </w:tc>
-        <w:tc>
-          <w:tcPr>
-            <w:tcW w:w="2400" w:type="dxa"/>
-          </w:tcPr>
-          <w:p>
-            <w:r>
-              <w:t>18</w:t>
+              <w:t>23</w:t>
+            </w:r>
+          </w:p>
+        </w:tc>
+      </w:tr>
+      <w:tr>
+        <w:tc>
+          <w:tcPr>
+            <w:tcW w:w="2400" w:type="dxa"/>
+          </w:tcPr>
+          <w:p>
+            <w:r>
+              <w:t>Passed</w:t>
+            </w:r>
+          </w:p>
+        </w:tc>
+        <w:tc>
+          <w:tcPr>
+            <w:tcW w:w="2400" w:type="dxa"/>
+          </w:tcPr>
+          <w:p>
+            <w:r>
+              <w:t>23</w:t>
             </w:r>
           </w:p>
         </w:tc>
@@ -318,6 +318,366 @@
           </w:tcPr>
           <w:p>
             <w:r>
+              <w:t>test_assign_payload_drone_not_found_404</w:t>
+            </w:r>
+          </w:p>
+        </w:tc>
+        <w:tc>
+          <w:tcPr>
+            <w:tcW w:w="2400" w:type="dxa"/>
+          </w:tcPr>
+          <w:p>
+            <w:r>
+              <w:t>Assigning to a non-existent drone must return 404.</w:t>
+            </w:r>
+          </w:p>
+        </w:tc>
+        <w:tc>
+          <w:tcPr>
+            <w:tcW w:w="2400" w:type="dxa"/>
+          </w:tcPr>
+          <w:p>
+            <w:r>
+              <w:t>Passed</w:t>
+            </w:r>
+          </w:p>
+        </w:tc>
+        <w:tc>
+          <w:tcPr>
+            <w:tcW w:w="2400" w:type="dxa"/>
+          </w:tcPr>
+          <w:p>
+            <w:r>
+              <w:t>0.328</w:t>
+            </w:r>
+          </w:p>
+        </w:tc>
+        <w:tc>
+          <w:tcPr>
+            <w:tcW w:w="2400" w:type="dxa"/>
+          </w:tcPr>
+          <w:p>
+            <w:r>
+              <w:t>asyncio</w:t>
+            </w:r>
+          </w:p>
+        </w:tc>
+        <w:tc>
+          <w:tcPr>
+            <w:tcW w:w="2400" w:type="dxa"/>
+          </w:tcPr>
+          <w:p>
+            <w:r>
+              <w:t>-</w:t>
+            </w:r>
+          </w:p>
+        </w:tc>
+      </w:tr>
+      <w:tr>
+        <w:tc>
+          <w:tcPr>
+            <w:tcW w:w="2400" w:type="dxa"/>
+          </w:tcPr>
+          <w:p>
+            <w:r>
+              <w:t>2</w:t>
+            </w:r>
+          </w:p>
+        </w:tc>
+        <w:tc>
+          <w:tcPr>
+            <w:tcW w:w="2400" w:type="dxa"/>
+          </w:tcPr>
+          <w:p>
+            <w:r>
+              <w:t>test_assign_payload_nonexistent_type_404</w:t>
+            </w:r>
+          </w:p>
+        </w:tc>
+        <w:tc>
+          <w:tcPr>
+            <w:tcW w:w="2400" w:type="dxa"/>
+          </w:tcPr>
+          <w:p>
+            <w:r>
+              <w:t>Assigning a non-existent payload_type_id must return 404.</w:t>
+            </w:r>
+          </w:p>
+        </w:tc>
+        <w:tc>
+          <w:tcPr>
+            <w:tcW w:w="2400" w:type="dxa"/>
+          </w:tcPr>
+          <w:p>
+            <w:r>
+              <w:t>Passed</w:t>
+            </w:r>
+          </w:p>
+        </w:tc>
+        <w:tc>
+          <w:tcPr>
+            <w:tcW w:w="2400" w:type="dxa"/>
+          </w:tcPr>
+          <w:p>
+            <w:r>
+              <w:t>0.664</w:t>
+            </w:r>
+          </w:p>
+        </w:tc>
+        <w:tc>
+          <w:tcPr>
+            <w:tcW w:w="2400" w:type="dxa"/>
+          </w:tcPr>
+          <w:p>
+            <w:r>
+              <w:t>asyncio</w:t>
+            </w:r>
+          </w:p>
+        </w:tc>
+        <w:tc>
+          <w:tcPr>
+            <w:tcW w:w="2400" w:type="dxa"/>
+          </w:tcPr>
+          <w:p>
+            <w:r>
+              <w:t>-</w:t>
+            </w:r>
+          </w:p>
+        </w:tc>
+      </w:tr>
+      <w:tr>
+        <w:tc>
+          <w:tcPr>
+            <w:tcW w:w="2400" w:type="dxa"/>
+          </w:tcPr>
+          <w:p>
+            <w:r>
+              <w:t>3</w:t>
+            </w:r>
+          </w:p>
+        </w:tc>
+        <w:tc>
+          <w:tcPr>
+            <w:tcW w:w="2400" w:type="dxa"/>
+          </w:tcPr>
+          <w:p>
+            <w:r>
+              <w:t>test_assign_payload_to_drone_200_with_admin</w:t>
+            </w:r>
+          </w:p>
+        </w:tc>
+        <w:tc>
+          <w:tcPr>
+            <w:tcW w:w="2400" w:type="dxa"/>
+          </w:tcPr>
+          <w:p>
+            <w:r>
+              <w:t>Full round-trip: admin creates a payload type, flight_controller assigns it | to a drone, then clears it — verifies assign and clear both persist.</w:t>
+            </w:r>
+          </w:p>
+        </w:tc>
+        <w:tc>
+          <w:tcPr>
+            <w:tcW w:w="2400" w:type="dxa"/>
+          </w:tcPr>
+          <w:p>
+            <w:r>
+              <w:t>Passed</w:t>
+            </w:r>
+          </w:p>
+        </w:tc>
+        <w:tc>
+          <w:tcPr>
+            <w:tcW w:w="2400" w:type="dxa"/>
+          </w:tcPr>
+          <w:p>
+            <w:r>
+              <w:t>0.719</w:t>
+            </w:r>
+          </w:p>
+        </w:tc>
+        <w:tc>
+          <w:tcPr>
+            <w:tcW w:w="2400" w:type="dxa"/>
+          </w:tcPr>
+          <w:p>
+            <w:r>
+              <w:t>asyncio</w:t>
+            </w:r>
+          </w:p>
+        </w:tc>
+        <w:tc>
+          <w:tcPr>
+            <w:tcW w:w="2400" w:type="dxa"/>
+          </w:tcPr>
+          <w:p>
+            <w:r>
+              <w:t>-</w:t>
+            </w:r>
+          </w:p>
+        </w:tc>
+      </w:tr>
+      <w:tr>
+        <w:tc>
+          <w:tcPr>
+            <w:tcW w:w="2400" w:type="dxa"/>
+          </w:tcPr>
+          <w:p>
+            <w:r>
+              <w:t>4</w:t>
+            </w:r>
+          </w:p>
+        </w:tc>
+        <w:tc>
+          <w:tcPr>
+            <w:tcW w:w="2400" w:type="dxa"/>
+          </w:tcPr>
+          <w:p>
+            <w:r>
+              <w:t>test_assign_payload_unauthenticated_401</w:t>
+            </w:r>
+          </w:p>
+        </w:tc>
+        <w:tc>
+          <w:tcPr>
+            <w:tcW w:w="2400" w:type="dxa"/>
+          </w:tcPr>
+          <w:p>
+            <w:r>
+              <w:t>Unauthenticated request must return 401.</w:t>
+            </w:r>
+          </w:p>
+        </w:tc>
+        <w:tc>
+          <w:tcPr>
+            <w:tcW w:w="2400" w:type="dxa"/>
+          </w:tcPr>
+          <w:p>
+            <w:r>
+              <w:t>Passed</w:t>
+            </w:r>
+          </w:p>
+        </w:tc>
+        <w:tc>
+          <w:tcPr>
+            <w:tcW w:w="2400" w:type="dxa"/>
+          </w:tcPr>
+          <w:p>
+            <w:r>
+              <w:t>0.358</w:t>
+            </w:r>
+          </w:p>
+        </w:tc>
+        <w:tc>
+          <w:tcPr>
+            <w:tcW w:w="2400" w:type="dxa"/>
+          </w:tcPr>
+          <w:p>
+            <w:r>
+              <w:t>asyncio</w:t>
+            </w:r>
+          </w:p>
+        </w:tc>
+        <w:tc>
+          <w:tcPr>
+            <w:tcW w:w="2400" w:type="dxa"/>
+          </w:tcPr>
+          <w:p>
+            <w:r>
+              <w:t>-</w:t>
+            </w:r>
+          </w:p>
+        </w:tc>
+      </w:tr>
+      <w:tr>
+        <w:tc>
+          <w:tcPr>
+            <w:tcW w:w="2400" w:type="dxa"/>
+          </w:tcPr>
+          <w:p>
+            <w:r>
+              <w:t>5</w:t>
+            </w:r>
+          </w:p>
+        </w:tc>
+        <w:tc>
+          <w:tcPr>
+            <w:tcW w:w="2400" w:type="dxa"/>
+          </w:tcPr>
+          <w:p>
+            <w:r>
+              <w:t>test_assign_payload_viewer_403</w:t>
+            </w:r>
+          </w:p>
+        </w:tc>
+        <w:tc>
+          <w:tcPr>
+            <w:tcW w:w="2400" w:type="dxa"/>
+          </w:tcPr>
+          <w:p>
+            <w:r>
+              <w:t>VIEWER cannot assign a payload — requires FLIGHT_CONTROLLER.</w:t>
+            </w:r>
+          </w:p>
+        </w:tc>
+        <w:tc>
+          <w:tcPr>
+            <w:tcW w:w="2400" w:type="dxa"/>
+          </w:tcPr>
+          <w:p>
+            <w:r>
+              <w:t>Passed</w:t>
+            </w:r>
+          </w:p>
+        </w:tc>
+        <w:tc>
+          <w:tcPr>
+            <w:tcW w:w="2400" w:type="dxa"/>
+          </w:tcPr>
+          <w:p>
+            <w:r>
+              <w:t>0.643</w:t>
+            </w:r>
+          </w:p>
+        </w:tc>
+        <w:tc>
+          <w:tcPr>
+            <w:tcW w:w="2400" w:type="dxa"/>
+          </w:tcPr>
+          <w:p>
+            <w:r>
+              <w:t>asyncio</w:t>
+            </w:r>
+          </w:p>
+        </w:tc>
+        <w:tc>
+          <w:tcPr>
+            <w:tcW w:w="2400" w:type="dxa"/>
+          </w:tcPr>
+          <w:p>
+            <w:r>
+              <w:t>-</w:t>
+            </w:r>
+          </w:p>
+        </w:tc>
+      </w:tr>
+      <w:tr>
+        <w:tc>
+          <w:tcPr>
+            <w:tcW w:w="2400" w:type="dxa"/>
+          </w:tcPr>
+          <w:p>
+            <w:r>
+              <w:t>6</w:t>
+            </w:r>
+          </w:p>
+        </w:tc>
+        <w:tc>
+          <w:tcPr>
+            <w:tcW w:w="2400" w:type="dxa"/>
+          </w:tcPr>
+          <w:p>
+            <w:r>
               <w:t>test_delete_drone_204</w:t>
             </w:r>
           </w:p>
@@ -348,39 +708,39 @@
           </w:tcPr>
           <w:p>
             <w:r>
-              <w:t>0.331</w:t>
-            </w:r>
-          </w:p>
-        </w:tc>
-        <w:tc>
-          <w:tcPr>
-            <w:tcW w:w="2400" w:type="dxa"/>
-          </w:tcPr>
-          <w:p>
-            <w:r>
-              <w:t>asyncio</w:t>
-            </w:r>
-          </w:p>
-        </w:tc>
-        <w:tc>
-          <w:tcPr>
-            <w:tcW w:w="2400" w:type="dxa"/>
-          </w:tcPr>
-          <w:p>
-            <w:r>
-              <w:t>-</w:t>
-            </w:r>
-          </w:p>
-        </w:tc>
-      </w:tr>
-      <w:tr>
-        <w:tc>
-          <w:tcPr>
-            <w:tcW w:w="2400" w:type="dxa"/>
-          </w:tcPr>
-          <w:p>
-            <w:r>
-              <w:t>2</w:t>
+              <w:t>0.371</w:t>
+            </w:r>
+          </w:p>
+        </w:tc>
+        <w:tc>
+          <w:tcPr>
+            <w:tcW w:w="2400" w:type="dxa"/>
+          </w:tcPr>
+          <w:p>
+            <w:r>
+              <w:t>asyncio</w:t>
+            </w:r>
+          </w:p>
+        </w:tc>
+        <w:tc>
+          <w:tcPr>
+            <w:tcW w:w="2400" w:type="dxa"/>
+          </w:tcPr>
+          <w:p>
+            <w:r>
+              <w:t>-</w:t>
+            </w:r>
+          </w:p>
+        </w:tc>
+      </w:tr>
+      <w:tr>
+        <w:tc>
+          <w:tcPr>
+            <w:tcW w:w="2400" w:type="dxa"/>
+          </w:tcPr>
+          <w:p>
+            <w:r>
+              <w:t>7</w:t>
             </w:r>
           </w:p>
         </w:tc>
@@ -420,39 +780,39 @@
           </w:tcPr>
           <w:p>
             <w:r>
-              <w:t>0.305</w:t>
-            </w:r>
-          </w:p>
-        </w:tc>
-        <w:tc>
-          <w:tcPr>
-            <w:tcW w:w="2400" w:type="dxa"/>
-          </w:tcPr>
-          <w:p>
-            <w:r>
-              <w:t>asyncio</w:t>
-            </w:r>
-          </w:p>
-        </w:tc>
-        <w:tc>
-          <w:tcPr>
-            <w:tcW w:w="2400" w:type="dxa"/>
-          </w:tcPr>
-          <w:p>
-            <w:r>
-              <w:t>-</w:t>
-            </w:r>
-          </w:p>
-        </w:tc>
-      </w:tr>
-      <w:tr>
-        <w:tc>
-          <w:tcPr>
-            <w:tcW w:w="2400" w:type="dxa"/>
-          </w:tcPr>
-          <w:p>
-            <w:r>
-              <w:t>3</w:t>
+              <w:t>0.327</w:t>
+            </w:r>
+          </w:p>
+        </w:tc>
+        <w:tc>
+          <w:tcPr>
+            <w:tcW w:w="2400" w:type="dxa"/>
+          </w:tcPr>
+          <w:p>
+            <w:r>
+              <w:t>asyncio</w:t>
+            </w:r>
+          </w:p>
+        </w:tc>
+        <w:tc>
+          <w:tcPr>
+            <w:tcW w:w="2400" w:type="dxa"/>
+          </w:tcPr>
+          <w:p>
+            <w:r>
+              <w:t>-</w:t>
+            </w:r>
+          </w:p>
+        </w:tc>
+      </w:tr>
+      <w:tr>
+        <w:tc>
+          <w:tcPr>
+            <w:tcW w:w="2400" w:type="dxa"/>
+          </w:tcPr>
+          <w:p>
+            <w:r>
+              <w:t>8</w:t>
             </w:r>
           </w:p>
         </w:tc>
@@ -492,39 +852,39 @@
           </w:tcPr>
           <w:p>
             <w:r>
-              <w:t>0.605</w:t>
-            </w:r>
-          </w:p>
-        </w:tc>
-        <w:tc>
-          <w:tcPr>
-            <w:tcW w:w="2400" w:type="dxa"/>
-          </w:tcPr>
-          <w:p>
-            <w:r>
-              <w:t>asyncio</w:t>
-            </w:r>
-          </w:p>
-        </w:tc>
-        <w:tc>
-          <w:tcPr>
-            <w:tcW w:w="2400" w:type="dxa"/>
-          </w:tcPr>
-          <w:p>
-            <w:r>
-              <w:t>-</w:t>
-            </w:r>
-          </w:p>
-        </w:tc>
-      </w:tr>
-      <w:tr>
-        <w:tc>
-          <w:tcPr>
-            <w:tcW w:w="2400" w:type="dxa"/>
-          </w:tcPr>
-          <w:p>
-            <w:r>
-              <w:t>4</w:t>
+              <w:t>0.654</w:t>
+            </w:r>
+          </w:p>
+        </w:tc>
+        <w:tc>
+          <w:tcPr>
+            <w:tcW w:w="2400" w:type="dxa"/>
+          </w:tcPr>
+          <w:p>
+            <w:r>
+              <w:t>asyncio</w:t>
+            </w:r>
+          </w:p>
+        </w:tc>
+        <w:tc>
+          <w:tcPr>
+            <w:tcW w:w="2400" w:type="dxa"/>
+          </w:tcPr>
+          <w:p>
+            <w:r>
+              <w:t>-</w:t>
+            </w:r>
+          </w:p>
+        </w:tc>
+      </w:tr>
+      <w:tr>
+        <w:tc>
+          <w:tcPr>
+            <w:tcW w:w="2400" w:type="dxa"/>
+          </w:tcPr>
+          <w:p>
+            <w:r>
+              <w:t>9</w:t>
             </w:r>
           </w:p>
         </w:tc>
@@ -564,39 +924,39 @@
           </w:tcPr>
           <w:p>
             <w:r>
-              <w:t>0.351</w:t>
-            </w:r>
-          </w:p>
-        </w:tc>
-        <w:tc>
-          <w:tcPr>
-            <w:tcW w:w="2400" w:type="dxa"/>
-          </w:tcPr>
-          <w:p>
-            <w:r>
-              <w:t>asyncio</w:t>
-            </w:r>
-          </w:p>
-        </w:tc>
-        <w:tc>
-          <w:tcPr>
-            <w:tcW w:w="2400" w:type="dxa"/>
-          </w:tcPr>
-          <w:p>
-            <w:r>
-              <w:t>-</w:t>
-            </w:r>
-          </w:p>
-        </w:tc>
-      </w:tr>
-      <w:tr>
-        <w:tc>
-          <w:tcPr>
-            <w:tcW w:w="2400" w:type="dxa"/>
-          </w:tcPr>
-          <w:p>
-            <w:r>
-              <w:t>5</w:t>
+              <w:t>0.366</w:t>
+            </w:r>
+          </w:p>
+        </w:tc>
+        <w:tc>
+          <w:tcPr>
+            <w:tcW w:w="2400" w:type="dxa"/>
+          </w:tcPr>
+          <w:p>
+            <w:r>
+              <w:t>asyncio</w:t>
+            </w:r>
+          </w:p>
+        </w:tc>
+        <w:tc>
+          <w:tcPr>
+            <w:tcW w:w="2400" w:type="dxa"/>
+          </w:tcPr>
+          <w:p>
+            <w:r>
+              <w:t>-</w:t>
+            </w:r>
+          </w:p>
+        </w:tc>
+      </w:tr>
+      <w:tr>
+        <w:tc>
+          <w:tcPr>
+            <w:tcW w:w="2400" w:type="dxa"/>
+          </w:tcPr>
+          <w:p>
+            <w:r>
+              <w:t>10</w:t>
             </w:r>
           </w:p>
         </w:tc>
@@ -636,39 +996,39 @@
           </w:tcPr>
           <w:p>
             <w:r>
-              <w:t>0.013</w:t>
-            </w:r>
-          </w:p>
-        </w:tc>
-        <w:tc>
-          <w:tcPr>
-            <w:tcW w:w="2400" w:type="dxa"/>
-          </w:tcPr>
-          <w:p>
-            <w:r>
-              <w:t>asyncio</w:t>
-            </w:r>
-          </w:p>
-        </w:tc>
-        <w:tc>
-          <w:tcPr>
-            <w:tcW w:w="2400" w:type="dxa"/>
-          </w:tcPr>
-          <w:p>
-            <w:r>
-              <w:t>-</w:t>
-            </w:r>
-          </w:p>
-        </w:tc>
-      </w:tr>
-      <w:tr>
-        <w:tc>
-          <w:tcPr>
-            <w:tcW w:w="2400" w:type="dxa"/>
-          </w:tcPr>
-          <w:p>
-            <w:r>
-              <w:t>6</w:t>
+              <w:t>0.020</w:t>
+            </w:r>
+          </w:p>
+        </w:tc>
+        <w:tc>
+          <w:tcPr>
+            <w:tcW w:w="2400" w:type="dxa"/>
+          </w:tcPr>
+          <w:p>
+            <w:r>
+              <w:t>asyncio</w:t>
+            </w:r>
+          </w:p>
+        </w:tc>
+        <w:tc>
+          <w:tcPr>
+            <w:tcW w:w="2400" w:type="dxa"/>
+          </w:tcPr>
+          <w:p>
+            <w:r>
+              <w:t>-</w:t>
+            </w:r>
+          </w:p>
+        </w:tc>
+      </w:tr>
+      <w:tr>
+        <w:tc>
+          <w:tcPr>
+            <w:tcW w:w="2400" w:type="dxa"/>
+          </w:tcPr>
+          <w:p>
+            <w:r>
+              <w:t>11</w:t>
             </w:r>
           </w:p>
         </w:tc>
@@ -708,39 +1068,39 @@
           </w:tcPr>
           <w:p>
             <w:r>
-              <w:t>0.680</w:t>
-            </w:r>
-          </w:p>
-        </w:tc>
-        <w:tc>
-          <w:tcPr>
-            <w:tcW w:w="2400" w:type="dxa"/>
-          </w:tcPr>
-          <w:p>
-            <w:r>
-              <w:t>asyncio</w:t>
-            </w:r>
-          </w:p>
-        </w:tc>
-        <w:tc>
-          <w:tcPr>
-            <w:tcW w:w="2400" w:type="dxa"/>
-          </w:tcPr>
-          <w:p>
-            <w:r>
-              <w:t>-</w:t>
-            </w:r>
-          </w:p>
-        </w:tc>
-      </w:tr>
-      <w:tr>
-        <w:tc>
-          <w:tcPr>
-            <w:tcW w:w="2400" w:type="dxa"/>
-          </w:tcPr>
-          <w:p>
-            <w:r>
-              <w:t>7</w:t>
+              <w:t>0.637</w:t>
+            </w:r>
+          </w:p>
+        </w:tc>
+        <w:tc>
+          <w:tcPr>
+            <w:tcW w:w="2400" w:type="dxa"/>
+          </w:tcPr>
+          <w:p>
+            <w:r>
+              <w:t>asyncio</w:t>
+            </w:r>
+          </w:p>
+        </w:tc>
+        <w:tc>
+          <w:tcPr>
+            <w:tcW w:w="2400" w:type="dxa"/>
+          </w:tcPr>
+          <w:p>
+            <w:r>
+              <w:t>-</w:t>
+            </w:r>
+          </w:p>
+        </w:tc>
+      </w:tr>
+      <w:tr>
+        <w:tc>
+          <w:tcPr>
+            <w:tcW w:w="2400" w:type="dxa"/>
+          </w:tcPr>
+          <w:p>
+            <w:r>
+              <w:t>12</w:t>
             </w:r>
           </w:p>
         </w:tc>
@@ -780,39 +1140,39 @@
           </w:tcPr>
           <w:p>
             <w:r>
-              <w:t>0.320</w:t>
-            </w:r>
-          </w:p>
-        </w:tc>
-        <w:tc>
-          <w:tcPr>
-            <w:tcW w:w="2400" w:type="dxa"/>
-          </w:tcPr>
-          <w:p>
-            <w:r>
-              <w:t>asyncio</w:t>
-            </w:r>
-          </w:p>
-        </w:tc>
-        <w:tc>
-          <w:tcPr>
-            <w:tcW w:w="2400" w:type="dxa"/>
-          </w:tcPr>
-          <w:p>
-            <w:r>
-              <w:t>-</w:t>
-            </w:r>
-          </w:p>
-        </w:tc>
-      </w:tr>
-      <w:tr>
-        <w:tc>
-          <w:tcPr>
-            <w:tcW w:w="2400" w:type="dxa"/>
-          </w:tcPr>
-          <w:p>
-            <w:r>
-              <w:t>8</w:t>
+              <w:t>0.309</w:t>
+            </w:r>
+          </w:p>
+        </w:tc>
+        <w:tc>
+          <w:tcPr>
+            <w:tcW w:w="2400" w:type="dxa"/>
+          </w:tcPr>
+          <w:p>
+            <w:r>
+              <w:t>asyncio</w:t>
+            </w:r>
+          </w:p>
+        </w:tc>
+        <w:tc>
+          <w:tcPr>
+            <w:tcW w:w="2400" w:type="dxa"/>
+          </w:tcPr>
+          <w:p>
+            <w:r>
+              <w:t>-</w:t>
+            </w:r>
+          </w:p>
+        </w:tc>
+      </w:tr>
+      <w:tr>
+        <w:tc>
+          <w:tcPr>
+            <w:tcW w:w="2400" w:type="dxa"/>
+          </w:tcPr>
+          <w:p>
+            <w:r>
+              <w:t>13</w:t>
             </w:r>
           </w:p>
         </w:tc>
@@ -852,39 +1212,39 @@
           </w:tcPr>
           <w:p>
             <w:r>
-              <w:t>0.620</w:t>
-            </w:r>
-          </w:p>
-        </w:tc>
-        <w:tc>
-          <w:tcPr>
-            <w:tcW w:w="2400" w:type="dxa"/>
-          </w:tcPr>
-          <w:p>
-            <w:r>
-              <w:t>asyncio</w:t>
-            </w:r>
-          </w:p>
-        </w:tc>
-        <w:tc>
-          <w:tcPr>
-            <w:tcW w:w="2400" w:type="dxa"/>
-          </w:tcPr>
-          <w:p>
-            <w:r>
-              <w:t>-</w:t>
-            </w:r>
-          </w:p>
-        </w:tc>
-      </w:tr>
-      <w:tr>
-        <w:tc>
-          <w:tcPr>
-            <w:tcW w:w="2400" w:type="dxa"/>
-          </w:tcPr>
-          <w:p>
-            <w:r>
-              <w:t>9</w:t>
+              <w:t>0.661</w:t>
+            </w:r>
+          </w:p>
+        </w:tc>
+        <w:tc>
+          <w:tcPr>
+            <w:tcW w:w="2400" w:type="dxa"/>
+          </w:tcPr>
+          <w:p>
+            <w:r>
+              <w:t>asyncio</w:t>
+            </w:r>
+          </w:p>
+        </w:tc>
+        <w:tc>
+          <w:tcPr>
+            <w:tcW w:w="2400" w:type="dxa"/>
+          </w:tcPr>
+          <w:p>
+            <w:r>
+              <w:t>-</w:t>
+            </w:r>
+          </w:p>
+        </w:tc>
+      </w:tr>
+      <w:tr>
+        <w:tc>
+          <w:tcPr>
+            <w:tcW w:w="2400" w:type="dxa"/>
+          </w:tcPr>
+          <w:p>
+            <w:r>
+              <w:t>14</w:t>
             </w:r>
           </w:p>
         </w:tc>
@@ -924,39 +1284,39 @@
           </w:tcPr>
           <w:p>
             <w:r>
-              <w:t>0.714</w:t>
-            </w:r>
-          </w:p>
-        </w:tc>
-        <w:tc>
-          <w:tcPr>
-            <w:tcW w:w="2400" w:type="dxa"/>
-          </w:tcPr>
-          <w:p>
-            <w:r>
-              <w:t>asyncio</w:t>
-            </w:r>
-          </w:p>
-        </w:tc>
-        <w:tc>
-          <w:tcPr>
-            <w:tcW w:w="2400" w:type="dxa"/>
-          </w:tcPr>
-          <w:p>
-            <w:r>
-              <w:t>-</w:t>
-            </w:r>
-          </w:p>
-        </w:tc>
-      </w:tr>
-      <w:tr>
-        <w:tc>
-          <w:tcPr>
-            <w:tcW w:w="2400" w:type="dxa"/>
-          </w:tcPr>
-          <w:p>
-            <w:r>
-              <w:t>10</w:t>
+              <w:t>0.674</w:t>
+            </w:r>
+          </w:p>
+        </w:tc>
+        <w:tc>
+          <w:tcPr>
+            <w:tcW w:w="2400" w:type="dxa"/>
+          </w:tcPr>
+          <w:p>
+            <w:r>
+              <w:t>asyncio</w:t>
+            </w:r>
+          </w:p>
+        </w:tc>
+        <w:tc>
+          <w:tcPr>
+            <w:tcW w:w="2400" w:type="dxa"/>
+          </w:tcPr>
+          <w:p>
+            <w:r>
+              <w:t>-</w:t>
+            </w:r>
+          </w:p>
+        </w:tc>
+      </w:tr>
+      <w:tr>
+        <w:tc>
+          <w:tcPr>
+            <w:tcW w:w="2400" w:type="dxa"/>
+          </w:tcPr>
+          <w:p>
+            <w:r>
+              <w:t>15</w:t>
             </w:r>
           </w:p>
         </w:tc>
@@ -996,39 +1356,39 @@
           </w:tcPr>
           <w:p>
             <w:r>
-              <w:t>0.619</w:t>
-            </w:r>
-          </w:p>
-        </w:tc>
-        <w:tc>
-          <w:tcPr>
-            <w:tcW w:w="2400" w:type="dxa"/>
-          </w:tcPr>
-          <w:p>
-            <w:r>
-              <w:t>asyncio</w:t>
-            </w:r>
-          </w:p>
-        </w:tc>
-        <w:tc>
-          <w:tcPr>
-            <w:tcW w:w="2400" w:type="dxa"/>
-          </w:tcPr>
-          <w:p>
-            <w:r>
-              <w:t>-</w:t>
-            </w:r>
-          </w:p>
-        </w:tc>
-      </w:tr>
-      <w:tr>
-        <w:tc>
-          <w:tcPr>
-            <w:tcW w:w="2400" w:type="dxa"/>
-          </w:tcPr>
-          <w:p>
-            <w:r>
-              <w:t>11</w:t>
+              <w:t>0.762</w:t>
+            </w:r>
+          </w:p>
+        </w:tc>
+        <w:tc>
+          <w:tcPr>
+            <w:tcW w:w="2400" w:type="dxa"/>
+          </w:tcPr>
+          <w:p>
+            <w:r>
+              <w:t>asyncio</w:t>
+            </w:r>
+          </w:p>
+        </w:tc>
+        <w:tc>
+          <w:tcPr>
+            <w:tcW w:w="2400" w:type="dxa"/>
+          </w:tcPr>
+          <w:p>
+            <w:r>
+              <w:t>-</w:t>
+            </w:r>
+          </w:p>
+        </w:tc>
+      </w:tr>
+      <w:tr>
+        <w:tc>
+          <w:tcPr>
+            <w:tcW w:w="2400" w:type="dxa"/>
+          </w:tcPr>
+          <w:p>
+            <w:r>
+              <w:t>16</w:t>
             </w:r>
           </w:p>
         </w:tc>
@@ -1068,39 +1428,39 @@
           </w:tcPr>
           <w:p>
             <w:r>
-              <w:t>0.644</w:t>
-            </w:r>
-          </w:p>
-        </w:tc>
-        <w:tc>
-          <w:tcPr>
-            <w:tcW w:w="2400" w:type="dxa"/>
-          </w:tcPr>
-          <w:p>
-            <w:r>
-              <w:t>asyncio</w:t>
-            </w:r>
-          </w:p>
-        </w:tc>
-        <w:tc>
-          <w:tcPr>
-            <w:tcW w:w="2400" w:type="dxa"/>
-          </w:tcPr>
-          <w:p>
-            <w:r>
-              <w:t>-</w:t>
-            </w:r>
-          </w:p>
-        </w:tc>
-      </w:tr>
-      <w:tr>
-        <w:tc>
-          <w:tcPr>
-            <w:tcW w:w="2400" w:type="dxa"/>
-          </w:tcPr>
-          <w:p>
-            <w:r>
-              <w:t>12</w:t>
+              <w:t>0.654</w:t>
+            </w:r>
+          </w:p>
+        </w:tc>
+        <w:tc>
+          <w:tcPr>
+            <w:tcW w:w="2400" w:type="dxa"/>
+          </w:tcPr>
+          <w:p>
+            <w:r>
+              <w:t>asyncio</w:t>
+            </w:r>
+          </w:p>
+        </w:tc>
+        <w:tc>
+          <w:tcPr>
+            <w:tcW w:w="2400" w:type="dxa"/>
+          </w:tcPr>
+          <w:p>
+            <w:r>
+              <w:t>-</w:t>
+            </w:r>
+          </w:p>
+        </w:tc>
+      </w:tr>
+      <w:tr>
+        <w:tc>
+          <w:tcPr>
+            <w:tcW w:w="2400" w:type="dxa"/>
+          </w:tcPr>
+          <w:p>
+            <w:r>
+              <w:t>17</w:t>
             </w:r>
           </w:p>
         </w:tc>
@@ -1140,39 +1500,39 @@
           </w:tcPr>
           <w:p>
             <w:r>
-              <w:t>0.628</w:t>
-            </w:r>
-          </w:p>
-        </w:tc>
-        <w:tc>
-          <w:tcPr>
-            <w:tcW w:w="2400" w:type="dxa"/>
-          </w:tcPr>
-          <w:p>
-            <w:r>
-              <w:t>asyncio</w:t>
-            </w:r>
-          </w:p>
-        </w:tc>
-        <w:tc>
-          <w:tcPr>
-            <w:tcW w:w="2400" w:type="dxa"/>
-          </w:tcPr>
-          <w:p>
-            <w:r>
-              <w:t>-</w:t>
-            </w:r>
-          </w:p>
-        </w:tc>
-      </w:tr>
-      <w:tr>
-        <w:tc>
-          <w:tcPr>
-            <w:tcW w:w="2400" w:type="dxa"/>
-          </w:tcPr>
-          <w:p>
-            <w:r>
-              <w:t>13</w:t>
+              <w:t>0.653</w:t>
+            </w:r>
+          </w:p>
+        </w:tc>
+        <w:tc>
+          <w:tcPr>
+            <w:tcW w:w="2400" w:type="dxa"/>
+          </w:tcPr>
+          <w:p>
+            <w:r>
+              <w:t>asyncio</w:t>
+            </w:r>
+          </w:p>
+        </w:tc>
+        <w:tc>
+          <w:tcPr>
+            <w:tcW w:w="2400" w:type="dxa"/>
+          </w:tcPr>
+          <w:p>
+            <w:r>
+              <w:t>-</w:t>
+            </w:r>
+          </w:p>
+        </w:tc>
+      </w:tr>
+      <w:tr>
+        <w:tc>
+          <w:tcPr>
+            <w:tcW w:w="2400" w:type="dxa"/>
+          </w:tcPr>
+          <w:p>
+            <w:r>
+              <w:t>18</w:t>
             </w:r>
           </w:p>
         </w:tc>
@@ -1212,39 +1572,39 @@
           </w:tcPr>
           <w:p>
             <w:r>
-              <w:t>0.329</w:t>
-            </w:r>
-          </w:p>
-        </w:tc>
-        <w:tc>
-          <w:tcPr>
-            <w:tcW w:w="2400" w:type="dxa"/>
-          </w:tcPr>
-          <w:p>
-            <w:r>
-              <w:t>asyncio</w:t>
-            </w:r>
-          </w:p>
-        </w:tc>
-        <w:tc>
-          <w:tcPr>
-            <w:tcW w:w="2400" w:type="dxa"/>
-          </w:tcPr>
-          <w:p>
-            <w:r>
-              <w:t>-</w:t>
-            </w:r>
-          </w:p>
-        </w:tc>
-      </w:tr>
-      <w:tr>
-        <w:tc>
-          <w:tcPr>
-            <w:tcW w:w="2400" w:type="dxa"/>
-          </w:tcPr>
-          <w:p>
-            <w:r>
-              <w:t>14</w:t>
+              <w:t>0.350</w:t>
+            </w:r>
+          </w:p>
+        </w:tc>
+        <w:tc>
+          <w:tcPr>
+            <w:tcW w:w="2400" w:type="dxa"/>
+          </w:tcPr>
+          <w:p>
+            <w:r>
+              <w:t>asyncio</w:t>
+            </w:r>
+          </w:p>
+        </w:tc>
+        <w:tc>
+          <w:tcPr>
+            <w:tcW w:w="2400" w:type="dxa"/>
+          </w:tcPr>
+          <w:p>
+            <w:r>
+              <w:t>-</w:t>
+            </w:r>
+          </w:p>
+        </w:tc>
+      </w:tr>
+      <w:tr>
+        <w:tc>
+          <w:tcPr>
+            <w:tcW w:w="2400" w:type="dxa"/>
+          </w:tcPr>
+          <w:p>
+            <w:r>
+              <w:t>19</w:t>
             </w:r>
           </w:p>
         </w:tc>
@@ -1316,7 +1676,7 @@
           </w:tcPr>
           <w:p>
             <w:r>
-              <w:t>15</w:t>
+              <w:t>20</w:t>
             </w:r>
           </w:p>
         </w:tc>
@@ -1356,39 +1716,39 @@
           </w:tcPr>
           <w:p>
             <w:r>
-              <w:t>0.345</w:t>
-            </w:r>
-          </w:p>
-        </w:tc>
-        <w:tc>
-          <w:tcPr>
-            <w:tcW w:w="2400" w:type="dxa"/>
-          </w:tcPr>
-          <w:p>
-            <w:r>
-              <w:t>asyncio</w:t>
-            </w:r>
-          </w:p>
-        </w:tc>
-        <w:tc>
-          <w:tcPr>
-            <w:tcW w:w="2400" w:type="dxa"/>
-          </w:tcPr>
-          <w:p>
-            <w:r>
-              <w:t>-</w:t>
-            </w:r>
-          </w:p>
-        </w:tc>
-      </w:tr>
-      <w:tr>
-        <w:tc>
-          <w:tcPr>
-            <w:tcW w:w="2400" w:type="dxa"/>
-          </w:tcPr>
-          <w:p>
-            <w:r>
-              <w:t>16</w:t>
+              <w:t>0.334</w:t>
+            </w:r>
+          </w:p>
+        </w:tc>
+        <w:tc>
+          <w:tcPr>
+            <w:tcW w:w="2400" w:type="dxa"/>
+          </w:tcPr>
+          <w:p>
+            <w:r>
+              <w:t>asyncio</w:t>
+            </w:r>
+          </w:p>
+        </w:tc>
+        <w:tc>
+          <w:tcPr>
+            <w:tcW w:w="2400" w:type="dxa"/>
+          </w:tcPr>
+          <w:p>
+            <w:r>
+              <w:t>-</w:t>
+            </w:r>
+          </w:p>
+        </w:tc>
+      </w:tr>
+      <w:tr>
+        <w:tc>
+          <w:tcPr>
+            <w:tcW w:w="2400" w:type="dxa"/>
+          </w:tcPr>
+          <w:p>
+            <w:r>
+              <w:t>21</w:t>
             </w:r>
           </w:p>
         </w:tc>
@@ -1428,39 +1788,39 @@
           </w:tcPr>
           <w:p>
             <w:r>
-              <w:t>0.318</w:t>
-            </w:r>
-          </w:p>
-        </w:tc>
-        <w:tc>
-          <w:tcPr>
-            <w:tcW w:w="2400" w:type="dxa"/>
-          </w:tcPr>
-          <w:p>
-            <w:r>
-              <w:t>asyncio</w:t>
-            </w:r>
-          </w:p>
-        </w:tc>
-        <w:tc>
-          <w:tcPr>
-            <w:tcW w:w="2400" w:type="dxa"/>
-          </w:tcPr>
-          <w:p>
-            <w:r>
-              <w:t>-</w:t>
-            </w:r>
-          </w:p>
-        </w:tc>
-      </w:tr>
-      <w:tr>
-        <w:tc>
-          <w:tcPr>
-            <w:tcW w:w="2400" w:type="dxa"/>
-          </w:tcPr>
-          <w:p>
-            <w:r>
-              <w:t>17</w:t>
+              <w:t>0.311</w:t>
+            </w:r>
+          </w:p>
+        </w:tc>
+        <w:tc>
+          <w:tcPr>
+            <w:tcW w:w="2400" w:type="dxa"/>
+          </w:tcPr>
+          <w:p>
+            <w:r>
+              <w:t>asyncio</w:t>
+            </w:r>
+          </w:p>
+        </w:tc>
+        <w:tc>
+          <w:tcPr>
+            <w:tcW w:w="2400" w:type="dxa"/>
+          </w:tcPr>
+          <w:p>
+            <w:r>
+              <w:t>-</w:t>
+            </w:r>
+          </w:p>
+        </w:tc>
+      </w:tr>
+      <w:tr>
+        <w:tc>
+          <w:tcPr>
+            <w:tcW w:w="2400" w:type="dxa"/>
+          </w:tcPr>
+          <w:p>
+            <w:r>
+              <w:t>22</w:t>
             </w:r>
           </w:p>
         </w:tc>
@@ -1500,39 +1860,39 @@
           </w:tcPr>
           <w:p>
             <w:r>
-              <w:t>0.352</w:t>
-            </w:r>
-          </w:p>
-        </w:tc>
-        <w:tc>
-          <w:tcPr>
-            <w:tcW w:w="2400" w:type="dxa"/>
-          </w:tcPr>
-          <w:p>
-            <w:r>
-              <w:t>asyncio</w:t>
-            </w:r>
-          </w:p>
-        </w:tc>
-        <w:tc>
-          <w:tcPr>
-            <w:tcW w:w="2400" w:type="dxa"/>
-          </w:tcPr>
-          <w:p>
-            <w:r>
-              <w:t>-</w:t>
-            </w:r>
-          </w:p>
-        </w:tc>
-      </w:tr>
-      <w:tr>
-        <w:tc>
-          <w:tcPr>
-            <w:tcW w:w="2400" w:type="dxa"/>
-          </w:tcPr>
-          <w:p>
-            <w:r>
-              <w:t>18</w:t>
+              <w:t>0.385</w:t>
+            </w:r>
+          </w:p>
+        </w:tc>
+        <w:tc>
+          <w:tcPr>
+            <w:tcW w:w="2400" w:type="dxa"/>
+          </w:tcPr>
+          <w:p>
+            <w:r>
+              <w:t>asyncio</w:t>
+            </w:r>
+          </w:p>
+        </w:tc>
+        <w:tc>
+          <w:tcPr>
+            <w:tcW w:w="2400" w:type="dxa"/>
+          </w:tcPr>
+          <w:p>
+            <w:r>
+              <w:t>-</w:t>
+            </w:r>
+          </w:p>
+        </w:tc>
+      </w:tr>
+      <w:tr>
+        <w:tc>
+          <w:tcPr>
+            <w:tcW w:w="2400" w:type="dxa"/>
+          </w:tcPr>
+          <w:p>
+            <w:r>
+              <w:t>23</w:t>
             </w:r>
           </w:p>
         </w:tc>
@@ -1572,7 +1932,7 @@
           </w:tcPr>
           <w:p>
             <w:r>
-              <w:t>0.589</w:t>
+              <w:t>0.622</w:t>
             </w:r>
           </w:p>
         </w:tc>

</xml_diff>

<commit_message>
Added updated code for resolving telemetry bugs
</commit_message>
<xml_diff>
--- a/backend/app/tests/reports/modules/test_drone_instances_api_documentation.docx
+++ b/backend/app/tests/reports/modules/test_drone_instances_api_documentation.docx
@@ -12,17 +12,17 @@
     </w:p>
     <w:p>
       <w:r>
-        <w:t>Generated at: 2026-07-13T06:11:35+00:00</w:t>
+        <w:t>Generated at: 2026-07-24T07:12:58+00:00</w:t>
       </w:r>
     </w:p>
     <w:p>
       <w:r>
-        <w:t>Test session started: 2026-07-13T06:08:37+00:00</w:t>
+        <w:t>Test session started: 2026-07-24T07:09:08+00:00</w:t>
       </w:r>
     </w:p>
     <w:p>
       <w:r>
-        <w:t>Pytest exit status: 0</w:t>
+        <w:t>Pytest exit status: 1</w:t>
       </w:r>
     </w:p>
     <w:p>
@@ -88,29 +88,29 @@
           </w:tcPr>
           <w:p>
             <w:r>
-              <w:t>23</w:t>
-            </w:r>
-          </w:p>
-        </w:tc>
-      </w:tr>
-      <w:tr>
-        <w:tc>
-          <w:tcPr>
-            <w:tcW w:w="2400" w:type="dxa"/>
-          </w:tcPr>
-          <w:p>
-            <w:r>
-              <w:t>Passed</w:t>
-            </w:r>
-          </w:p>
-        </w:tc>
-        <w:tc>
-          <w:tcPr>
-            <w:tcW w:w="2400" w:type="dxa"/>
-          </w:tcPr>
-          <w:p>
-            <w:r>
-              <w:t>23</w:t>
+              <w:t>24</w:t>
+            </w:r>
+          </w:p>
+        </w:tc>
+      </w:tr>
+      <w:tr>
+        <w:tc>
+          <w:tcPr>
+            <w:tcW w:w="2400" w:type="dxa"/>
+          </w:tcPr>
+          <w:p>
+            <w:r>
+              <w:t>Passed</w:t>
+            </w:r>
+          </w:p>
+        </w:tc>
+        <w:tc>
+          <w:tcPr>
+            <w:tcW w:w="2400" w:type="dxa"/>
+          </w:tcPr>
+          <w:p>
+            <w:r>
+              <w:t>24</w:t>
             </w:r>
           </w:p>
         </w:tc>
@@ -348,7 +348,7 @@
           </w:tcPr>
           <w:p>
             <w:r>
-              <w:t>0.328</w:t>
+              <w:t>0.294</w:t>
             </w:r>
           </w:p>
         </w:tc>
@@ -420,7 +420,7 @@
           </w:tcPr>
           <w:p>
             <w:r>
-              <w:t>0.664</w:t>
+              <w:t>0.628</w:t>
             </w:r>
           </w:p>
         </w:tc>
@@ -492,7 +492,7 @@
           </w:tcPr>
           <w:p>
             <w:r>
-              <w:t>0.719</w:t>
+              <w:t>0.685</w:t>
             </w:r>
           </w:p>
         </w:tc>
@@ -564,7 +564,7 @@
           </w:tcPr>
           <w:p>
             <w:r>
-              <w:t>0.358</w:t>
+              <w:t>0.329</w:t>
             </w:r>
           </w:p>
         </w:tc>
@@ -636,7 +636,7 @@
           </w:tcPr>
           <w:p>
             <w:r>
-              <w:t>0.643</w:t>
+              <w:t>0.605</w:t>
             </w:r>
           </w:p>
         </w:tc>
@@ -678,37 +678,37 @@
           </w:tcPr>
           <w:p>
             <w:r>
-              <w:t>test_delete_drone_204</w:t>
-            </w:r>
-          </w:p>
-        </w:tc>
-        <w:tc>
-          <w:tcPr>
-            <w:tcW w:w="2400" w:type="dxa"/>
-          </w:tcPr>
-          <w:p>
-            <w:r>
-              <w:t>DELETE removes the drone instance and returns 204.</w:t>
-            </w:r>
-          </w:p>
-        </w:tc>
-        <w:tc>
-          <w:tcPr>
-            <w:tcW w:w="2400" w:type="dxa"/>
-          </w:tcPr>
-          <w:p>
-            <w:r>
-              <w:t>Passed</w:t>
-            </w:r>
-          </w:p>
-        </w:tc>
-        <w:tc>
-          <w:tcPr>
-            <w:tcW w:w="2400" w:type="dxa"/>
-          </w:tcPr>
-          <w:p>
-            <w:r>
-              <w:t>0.371</w:t>
+              <w:t>test_delete_drone_not_found_404</w:t>
+            </w:r>
+          </w:p>
+        </w:tc>
+        <w:tc>
+          <w:tcPr>
+            <w:tcW w:w="2400" w:type="dxa"/>
+          </w:tcPr>
+          <w:p>
+            <w:r>
+              <w:t>DELETE on a non-existent drone ID must return 404.</w:t>
+            </w:r>
+          </w:p>
+        </w:tc>
+        <w:tc>
+          <w:tcPr>
+            <w:tcW w:w="2400" w:type="dxa"/>
+          </w:tcPr>
+          <w:p>
+            <w:r>
+              <w:t>Passed</w:t>
+            </w:r>
+          </w:p>
+        </w:tc>
+        <w:tc>
+          <w:tcPr>
+            <w:tcW w:w="2400" w:type="dxa"/>
+          </w:tcPr>
+          <w:p>
+            <w:r>
+              <w:t>0.352</w:t>
             </w:r>
           </w:p>
         </w:tc>
@@ -750,37 +750,37 @@
           </w:tcPr>
           <w:p>
             <w:r>
-              <w:t>test_delete_drone_not_found_404</w:t>
-            </w:r>
-          </w:p>
-        </w:tc>
-        <w:tc>
-          <w:tcPr>
-            <w:tcW w:w="2400" w:type="dxa"/>
-          </w:tcPr>
-          <w:p>
-            <w:r>
-              <w:t>DELETE on a non-existent drone ID must return 404.</w:t>
-            </w:r>
-          </w:p>
-        </w:tc>
-        <w:tc>
-          <w:tcPr>
-            <w:tcW w:w="2400" w:type="dxa"/>
-          </w:tcPr>
-          <w:p>
-            <w:r>
-              <w:t>Passed</w:t>
-            </w:r>
-          </w:p>
-        </w:tc>
-        <w:tc>
-          <w:tcPr>
-            <w:tcW w:w="2400" w:type="dxa"/>
-          </w:tcPr>
-          <w:p>
-            <w:r>
-              <w:t>0.327</w:t>
+              <w:t>test_delete_drone_viewer_403</w:t>
+            </w:r>
+          </w:p>
+        </w:tc>
+        <w:tc>
+          <w:tcPr>
+            <w:tcW w:w="2400" w:type="dxa"/>
+          </w:tcPr>
+          <w:p>
+            <w:r>
+              <w:t>VIEWER role must not be able to delete a drone instance → 403.</w:t>
+            </w:r>
+          </w:p>
+        </w:tc>
+        <w:tc>
+          <w:tcPr>
+            <w:tcW w:w="2400" w:type="dxa"/>
+          </w:tcPr>
+          <w:p>
+            <w:r>
+              <w:t>Passed</w:t>
+            </w:r>
+          </w:p>
+        </w:tc>
+        <w:tc>
+          <w:tcPr>
+            <w:tcW w:w="2400" w:type="dxa"/>
+          </w:tcPr>
+          <w:p>
+            <w:r>
+              <w:t>0.827</w:t>
             </w:r>
           </w:p>
         </w:tc>
@@ -822,37 +822,37 @@
           </w:tcPr>
           <w:p>
             <w:r>
-              <w:t>test_delete_drone_viewer_403</w:t>
-            </w:r>
-          </w:p>
-        </w:tc>
-        <w:tc>
-          <w:tcPr>
-            <w:tcW w:w="2400" w:type="dxa"/>
-          </w:tcPr>
-          <w:p>
-            <w:r>
-              <w:t>VIEWER role must not be able to delete a drone instance → 403.</w:t>
-            </w:r>
-          </w:p>
-        </w:tc>
-        <w:tc>
-          <w:tcPr>
-            <w:tcW w:w="2400" w:type="dxa"/>
-          </w:tcPr>
-          <w:p>
-            <w:r>
-              <w:t>Passed</w:t>
-            </w:r>
-          </w:p>
-        </w:tc>
-        <w:tc>
-          <w:tcPr>
-            <w:tcW w:w="2400" w:type="dxa"/>
-          </w:tcPr>
-          <w:p>
-            <w:r>
-              <w:t>0.654</w:t>
+              <w:t>test_drone_instance_all_fields_persisted</w:t>
+            </w:r>
+          </w:p>
+        </w:tc>
+        <w:tc>
+          <w:tcPr>
+            <w:tcW w:w="2400" w:type="dxa"/>
+          </w:tcPr>
+          <w:p>
+            <w:r>
+              <w:t>Every field submitted on POST must be retrievable unchanged via GET.</w:t>
+            </w:r>
+          </w:p>
+        </w:tc>
+        <w:tc>
+          <w:tcPr>
+            <w:tcW w:w="2400" w:type="dxa"/>
+          </w:tcPr>
+          <w:p>
+            <w:r>
+              <w:t>Passed</w:t>
+            </w:r>
+          </w:p>
+        </w:tc>
+        <w:tc>
+          <w:tcPr>
+            <w:tcW w:w="2400" w:type="dxa"/>
+          </w:tcPr>
+          <w:p>
+            <w:r>
+              <w:t>0.926</w:t>
             </w:r>
           </w:p>
         </w:tc>
@@ -894,37 +894,37 @@
           </w:tcPr>
           <w:p>
             <w:r>
-              <w:t>test_drone_instance_all_fields_persisted</w:t>
-            </w:r>
-          </w:p>
-        </w:tc>
-        <w:tc>
-          <w:tcPr>
-            <w:tcW w:w="2400" w:type="dxa"/>
-          </w:tcPr>
-          <w:p>
-            <w:r>
-              <w:t>Every field submitted on POST must be retrievable unchanged via GET.</w:t>
-            </w:r>
-          </w:p>
-        </w:tc>
-        <w:tc>
-          <w:tcPr>
-            <w:tcW w:w="2400" w:type="dxa"/>
-          </w:tcPr>
-          <w:p>
-            <w:r>
-              <w:t>Passed</w:t>
-            </w:r>
-          </w:p>
-        </w:tc>
-        <w:tc>
-          <w:tcPr>
-            <w:tcW w:w="2400" w:type="dxa"/>
-          </w:tcPr>
-          <w:p>
-            <w:r>
-              <w:t>0.366</w:t>
+              <w:t>test_drones_unauthenticated_401</w:t>
+            </w:r>
+          </w:p>
+        </w:tc>
+        <w:tc>
+          <w:tcPr>
+            <w:tcW w:w="2400" w:type="dxa"/>
+          </w:tcPr>
+          <w:p>
+            <w:r>
+              <w:t>Drones unauthenticated 401</w:t>
+            </w:r>
+          </w:p>
+        </w:tc>
+        <w:tc>
+          <w:tcPr>
+            <w:tcW w:w="2400" w:type="dxa"/>
+          </w:tcPr>
+          <w:p>
+            <w:r>
+              <w:t>Passed</w:t>
+            </w:r>
+          </w:p>
+        </w:tc>
+        <w:tc>
+          <w:tcPr>
+            <w:tcW w:w="2400" w:type="dxa"/>
+          </w:tcPr>
+          <w:p>
+            <w:r>
+              <w:t>0.022</w:t>
             </w:r>
           </w:p>
         </w:tc>
@@ -966,37 +966,37 @@
           </w:tcPr>
           <w:p>
             <w:r>
-              <w:t>test_drones_unauthenticated_401</w:t>
-            </w:r>
-          </w:p>
-        </w:tc>
-        <w:tc>
-          <w:tcPr>
-            <w:tcW w:w="2400" w:type="dxa"/>
-          </w:tcPr>
-          <w:p>
-            <w:r>
-              <w:t>Drones unauthenticated 401</w:t>
-            </w:r>
-          </w:p>
-        </w:tc>
-        <w:tc>
-          <w:tcPr>
-            <w:tcW w:w="2400" w:type="dxa"/>
-          </w:tcPr>
-          <w:p>
-            <w:r>
-              <w:t>Passed</w:t>
-            </w:r>
-          </w:p>
-        </w:tc>
-        <w:tc>
-          <w:tcPr>
-            <w:tcW w:w="2400" w:type="dxa"/>
-          </w:tcPr>
-          <w:p>
-            <w:r>
-              <w:t>0.020</w:t>
+              <w:t>test_get_drone_200</w:t>
+            </w:r>
+          </w:p>
+        </w:tc>
+        <w:tc>
+          <w:tcPr>
+            <w:tcW w:w="2400" w:type="dxa"/>
+          </w:tcPr>
+          <w:p>
+            <w:r>
+              <w:t>Get drone 200</w:t>
+            </w:r>
+          </w:p>
+        </w:tc>
+        <w:tc>
+          <w:tcPr>
+            <w:tcW w:w="2400" w:type="dxa"/>
+          </w:tcPr>
+          <w:p>
+            <w:r>
+              <w:t>Passed</w:t>
+            </w:r>
+          </w:p>
+        </w:tc>
+        <w:tc>
+          <w:tcPr>
+            <w:tcW w:w="2400" w:type="dxa"/>
+          </w:tcPr>
+          <w:p>
+            <w:r>
+              <w:t>0.718</w:t>
             </w:r>
           </w:p>
         </w:tc>
@@ -1038,37 +1038,37 @@
           </w:tcPr>
           <w:p>
             <w:r>
-              <w:t>test_get_drone_200</w:t>
-            </w:r>
-          </w:p>
-        </w:tc>
-        <w:tc>
-          <w:tcPr>
-            <w:tcW w:w="2400" w:type="dxa"/>
-          </w:tcPr>
-          <w:p>
-            <w:r>
-              <w:t>Get drone 200</w:t>
-            </w:r>
-          </w:p>
-        </w:tc>
-        <w:tc>
-          <w:tcPr>
-            <w:tcW w:w="2400" w:type="dxa"/>
-          </w:tcPr>
-          <w:p>
-            <w:r>
-              <w:t>Passed</w:t>
-            </w:r>
-          </w:p>
-        </w:tc>
-        <w:tc>
-          <w:tcPr>
-            <w:tcW w:w="2400" w:type="dxa"/>
-          </w:tcPr>
-          <w:p>
-            <w:r>
-              <w:t>0.637</w:t>
+              <w:t>test_get_drone_not_found_404</w:t>
+            </w:r>
+          </w:p>
+        </w:tc>
+        <w:tc>
+          <w:tcPr>
+            <w:tcW w:w="2400" w:type="dxa"/>
+          </w:tcPr>
+          <w:p>
+            <w:r>
+              <w:t>Get drone not found 404</w:t>
+            </w:r>
+          </w:p>
+        </w:tc>
+        <w:tc>
+          <w:tcPr>
+            <w:tcW w:w="2400" w:type="dxa"/>
+          </w:tcPr>
+          <w:p>
+            <w:r>
+              <w:t>Passed</w:t>
+            </w:r>
+          </w:p>
+        </w:tc>
+        <w:tc>
+          <w:tcPr>
+            <w:tcW w:w="2400" w:type="dxa"/>
+          </w:tcPr>
+          <w:p>
+            <w:r>
+              <w:t>0.497</w:t>
             </w:r>
           </w:p>
         </w:tc>
@@ -1110,37 +1110,37 @@
           </w:tcPr>
           <w:p>
             <w:r>
-              <w:t>test_get_drone_not_found_404</w:t>
-            </w:r>
-          </w:p>
-        </w:tc>
-        <w:tc>
-          <w:tcPr>
-            <w:tcW w:w="2400" w:type="dxa"/>
-          </w:tcPr>
-          <w:p>
-            <w:r>
-              <w:t>Get drone not found 404</w:t>
-            </w:r>
-          </w:p>
-        </w:tc>
-        <w:tc>
-          <w:tcPr>
-            <w:tcW w:w="2400" w:type="dxa"/>
-          </w:tcPr>
-          <w:p>
-            <w:r>
-              <w:t>Passed</w:t>
-            </w:r>
-          </w:p>
-        </w:tc>
-        <w:tc>
-          <w:tcPr>
-            <w:tcW w:w="2400" w:type="dxa"/>
-          </w:tcPr>
-          <w:p>
-            <w:r>
-              <w:t>0.309</w:t>
+              <w:t>test_get_drone_type_spec_200</w:t>
+            </w:r>
+          </w:p>
+        </w:tc>
+        <w:tc>
+          <w:tcPr>
+            <w:tcW w:w="2400" w:type="dxa"/>
+          </w:tcPr>
+          <w:p>
+            <w:r>
+              <w:t>type-spec endpoint returns the full DroneType for the instance.</w:t>
+            </w:r>
+          </w:p>
+        </w:tc>
+        <w:tc>
+          <w:tcPr>
+            <w:tcW w:w="2400" w:type="dxa"/>
+          </w:tcPr>
+          <w:p>
+            <w:r>
+              <w:t>Passed</w:t>
+            </w:r>
+          </w:p>
+        </w:tc>
+        <w:tc>
+          <w:tcPr>
+            <w:tcW w:w="2400" w:type="dxa"/>
+          </w:tcPr>
+          <w:p>
+            <w:r>
+              <w:t>1.057</w:t>
             </w:r>
           </w:p>
         </w:tc>
@@ -1182,37 +1182,37 @@
           </w:tcPr>
           <w:p>
             <w:r>
-              <w:t>test_get_drone_type_spec_200</w:t>
-            </w:r>
-          </w:p>
-        </w:tc>
-        <w:tc>
-          <w:tcPr>
-            <w:tcW w:w="2400" w:type="dxa"/>
-          </w:tcPr>
-          <w:p>
-            <w:r>
-              <w:t>type-spec endpoint returns the full DroneType for the instance.</w:t>
-            </w:r>
-          </w:p>
-        </w:tc>
-        <w:tc>
-          <w:tcPr>
-            <w:tcW w:w="2400" w:type="dxa"/>
-          </w:tcPr>
-          <w:p>
-            <w:r>
-              <w:t>Passed</w:t>
-            </w:r>
-          </w:p>
-        </w:tc>
-        <w:tc>
-          <w:tcPr>
-            <w:tcW w:w="2400" w:type="dxa"/>
-          </w:tcPr>
-          <w:p>
-            <w:r>
-              <w:t>0.661</w:t>
+              <w:t>test_list_drones_200</w:t>
+            </w:r>
+          </w:p>
+        </w:tc>
+        <w:tc>
+          <w:tcPr>
+            <w:tcW w:w="2400" w:type="dxa"/>
+          </w:tcPr>
+          <w:p>
+            <w:r>
+              <w:t>List drones 200</w:t>
+            </w:r>
+          </w:p>
+        </w:tc>
+        <w:tc>
+          <w:tcPr>
+            <w:tcW w:w="2400" w:type="dxa"/>
+          </w:tcPr>
+          <w:p>
+            <w:r>
+              <w:t>Passed</w:t>
+            </w:r>
+          </w:p>
+        </w:tc>
+        <w:tc>
+          <w:tcPr>
+            <w:tcW w:w="2400" w:type="dxa"/>
+          </w:tcPr>
+          <w:p>
+            <w:r>
+              <w:t>0.697</w:t>
             </w:r>
           </w:p>
         </w:tc>
@@ -1254,37 +1254,37 @@
           </w:tcPr>
           <w:p>
             <w:r>
-              <w:t>test_list_drones_200</w:t>
-            </w:r>
-          </w:p>
-        </w:tc>
-        <w:tc>
-          <w:tcPr>
-            <w:tcW w:w="2400" w:type="dxa"/>
-          </w:tcPr>
-          <w:p>
-            <w:r>
-              <w:t>List drones 200</w:t>
-            </w:r>
-          </w:p>
-        </w:tc>
-        <w:tc>
-          <w:tcPr>
-            <w:tcW w:w="2400" w:type="dxa"/>
-          </w:tcPr>
-          <w:p>
-            <w:r>
-              <w:t>Passed</w:t>
-            </w:r>
-          </w:p>
-        </w:tc>
-        <w:tc>
-          <w:tcPr>
-            <w:tcW w:w="2400" w:type="dxa"/>
-          </w:tcPr>
-          <w:p>
-            <w:r>
-              <w:t>0.674</w:t>
+              <w:t>test_patch_drone_status_200</w:t>
+            </w:r>
+          </w:p>
+        </w:tc>
+        <w:tc>
+          <w:tcPr>
+            <w:tcW w:w="2400" w:type="dxa"/>
+          </w:tcPr>
+          <w:p>
+            <w:r>
+              <w:t>FLIGHT_CONTROLLER can update drone status.</w:t>
+            </w:r>
+          </w:p>
+        </w:tc>
+        <w:tc>
+          <w:tcPr>
+            <w:tcW w:w="2400" w:type="dxa"/>
+          </w:tcPr>
+          <w:p>
+            <w:r>
+              <w:t>Passed</w:t>
+            </w:r>
+          </w:p>
+        </w:tc>
+        <w:tc>
+          <w:tcPr>
+            <w:tcW w:w="2400" w:type="dxa"/>
+          </w:tcPr>
+          <w:p>
+            <w:r>
+              <w:t>0.820</w:t>
             </w:r>
           </w:p>
         </w:tc>
@@ -1326,37 +1326,37 @@
           </w:tcPr>
           <w:p>
             <w:r>
-              <w:t>test_patch_drone_status_200</w:t>
-            </w:r>
-          </w:p>
-        </w:tc>
-        <w:tc>
-          <w:tcPr>
-            <w:tcW w:w="2400" w:type="dxa"/>
-          </w:tcPr>
-          <w:p>
-            <w:r>
-              <w:t>FLIGHT_CONTROLLER can update drone status.</w:t>
-            </w:r>
-          </w:p>
-        </w:tc>
-        <w:tc>
-          <w:tcPr>
-            <w:tcW w:w="2400" w:type="dxa"/>
-          </w:tcPr>
-          <w:p>
-            <w:r>
-              <w:t>Passed</w:t>
-            </w:r>
-          </w:p>
-        </w:tc>
-        <w:tc>
-          <w:tcPr>
-            <w:tcW w:w="2400" w:type="dxa"/>
-          </w:tcPr>
-          <w:p>
-            <w:r>
-              <w:t>0.762</w:t>
+              <w:t>test_patch_drone_status_invalid_400</w:t>
+            </w:r>
+          </w:p>
+        </w:tc>
+        <w:tc>
+          <w:tcPr>
+            <w:tcW w:w="2400" w:type="dxa"/>
+          </w:tcPr>
+          <w:p>
+            <w:r>
+              <w:t>Invalid status value must return 400.</w:t>
+            </w:r>
+          </w:p>
+        </w:tc>
+        <w:tc>
+          <w:tcPr>
+            <w:tcW w:w="2400" w:type="dxa"/>
+          </w:tcPr>
+          <w:p>
+            <w:r>
+              <w:t>Passed</w:t>
+            </w:r>
+          </w:p>
+        </w:tc>
+        <w:tc>
+          <w:tcPr>
+            <w:tcW w:w="2400" w:type="dxa"/>
+          </w:tcPr>
+          <w:p>
+            <w:r>
+              <w:t>0.849</w:t>
             </w:r>
           </w:p>
         </w:tc>
@@ -1398,37 +1398,37 @@
           </w:tcPr>
           <w:p>
             <w:r>
-              <w:t>test_patch_drone_status_invalid_400</w:t>
-            </w:r>
-          </w:p>
-        </w:tc>
-        <w:tc>
-          <w:tcPr>
-            <w:tcW w:w="2400" w:type="dxa"/>
-          </w:tcPr>
-          <w:p>
-            <w:r>
-              <w:t>Invalid status value must return 400.</w:t>
-            </w:r>
-          </w:p>
-        </w:tc>
-        <w:tc>
-          <w:tcPr>
-            <w:tcW w:w="2400" w:type="dxa"/>
-          </w:tcPr>
-          <w:p>
-            <w:r>
-              <w:t>Passed</w:t>
-            </w:r>
-          </w:p>
-        </w:tc>
-        <w:tc>
-          <w:tcPr>
-            <w:tcW w:w="2400" w:type="dxa"/>
-          </w:tcPr>
-          <w:p>
-            <w:r>
-              <w:t>0.654</w:t>
+              <w:t>test_patch_drone_status_viewer_403</w:t>
+            </w:r>
+          </w:p>
+        </w:tc>
+        <w:tc>
+          <w:tcPr>
+            <w:tcW w:w="2400" w:type="dxa"/>
+          </w:tcPr>
+          <w:p>
+            <w:r>
+              <w:t>VIEWER cannot patch drone status.</w:t>
+            </w:r>
+          </w:p>
+        </w:tc>
+        <w:tc>
+          <w:tcPr>
+            <w:tcW w:w="2400" w:type="dxa"/>
+          </w:tcPr>
+          <w:p>
+            <w:r>
+              <w:t>Passed</w:t>
+            </w:r>
+          </w:p>
+        </w:tc>
+        <w:tc>
+          <w:tcPr>
+            <w:tcW w:w="2400" w:type="dxa"/>
+          </w:tcPr>
+          <w:p>
+            <w:r>
+              <w:t>1.139</w:t>
             </w:r>
           </w:p>
         </w:tc>
@@ -1470,37 +1470,37 @@
           </w:tcPr>
           <w:p>
             <w:r>
-              <w:t>test_patch_drone_status_viewer_403</w:t>
-            </w:r>
-          </w:p>
-        </w:tc>
-        <w:tc>
-          <w:tcPr>
-            <w:tcW w:w="2400" w:type="dxa"/>
-          </w:tcPr>
-          <w:p>
-            <w:r>
-              <w:t>VIEWER cannot patch drone status.</w:t>
-            </w:r>
-          </w:p>
-        </w:tc>
-        <w:tc>
-          <w:tcPr>
-            <w:tcW w:w="2400" w:type="dxa"/>
-          </w:tcPr>
-          <w:p>
-            <w:r>
-              <w:t>Passed</w:t>
-            </w:r>
-          </w:p>
-        </w:tc>
-        <w:tc>
-          <w:tcPr>
-            <w:tcW w:w="2400" w:type="dxa"/>
-          </w:tcPr>
-          <w:p>
-            <w:r>
-              <w:t>0.653</w:t>
+              <w:t>test_register_drone_201</w:t>
+            </w:r>
+          </w:p>
+        </w:tc>
+        <w:tc>
+          <w:tcPr>
+            <w:tcW w:w="2400" w:type="dxa"/>
+          </w:tcPr>
+          <w:p>
+            <w:r>
+              <w:t>Register drone 201</w:t>
+            </w:r>
+          </w:p>
+        </w:tc>
+        <w:tc>
+          <w:tcPr>
+            <w:tcW w:w="2400" w:type="dxa"/>
+          </w:tcPr>
+          <w:p>
+            <w:r>
+              <w:t>Passed</w:t>
+            </w:r>
+          </w:p>
+        </w:tc>
+        <w:tc>
+          <w:tcPr>
+            <w:tcW w:w="2400" w:type="dxa"/>
+          </w:tcPr>
+          <w:p>
+            <w:r>
+              <w:t>0.326</w:t>
             </w:r>
           </w:p>
         </w:tc>
@@ -1542,37 +1542,37 @@
           </w:tcPr>
           <w:p>
             <w:r>
-              <w:t>test_register_drone_201</w:t>
-            </w:r>
-          </w:p>
-        </w:tc>
-        <w:tc>
-          <w:tcPr>
-            <w:tcW w:w="2400" w:type="dxa"/>
-          </w:tcPr>
-          <w:p>
-            <w:r>
-              <w:t>Register drone 201</w:t>
-            </w:r>
-          </w:p>
-        </w:tc>
-        <w:tc>
-          <w:tcPr>
-            <w:tcW w:w="2400" w:type="dxa"/>
-          </w:tcPr>
-          <w:p>
-            <w:r>
-              <w:t>Passed</w:t>
-            </w:r>
-          </w:p>
-        </w:tc>
-        <w:tc>
-          <w:tcPr>
-            <w:tcW w:w="2400" w:type="dxa"/>
-          </w:tcPr>
-          <w:p>
-            <w:r>
-              <w:t>0.350</w:t>
+              <w:t>test_register_drone_duplicate_callsign_409</w:t>
+            </w:r>
+          </w:p>
+        </w:tc>
+        <w:tc>
+          <w:tcPr>
+            <w:tcW w:w="2400" w:type="dxa"/>
+          </w:tcPr>
+          <w:p>
+            <w:r>
+              <w:t>Register drone duplicate callsign 409</w:t>
+            </w:r>
+          </w:p>
+        </w:tc>
+        <w:tc>
+          <w:tcPr>
+            <w:tcW w:w="2400" w:type="dxa"/>
+          </w:tcPr>
+          <w:p>
+            <w:r>
+              <w:t>Passed</w:t>
+            </w:r>
+          </w:p>
+        </w:tc>
+        <w:tc>
+          <w:tcPr>
+            <w:tcW w:w="2400" w:type="dxa"/>
+          </w:tcPr>
+          <w:p>
+            <w:r>
+              <w:t>0.348</w:t>
             </w:r>
           </w:p>
         </w:tc>
@@ -1614,37 +1614,37 @@
           </w:tcPr>
           <w:p>
             <w:r>
-              <w:t>test_register_drone_duplicate_callsign_409</w:t>
-            </w:r>
-          </w:p>
-        </w:tc>
-        <w:tc>
-          <w:tcPr>
-            <w:tcW w:w="2400" w:type="dxa"/>
-          </w:tcPr>
-          <w:p>
-            <w:r>
-              <w:t>Register drone duplicate callsign 409</w:t>
-            </w:r>
-          </w:p>
-        </w:tc>
-        <w:tc>
-          <w:tcPr>
-            <w:tcW w:w="2400" w:type="dxa"/>
-          </w:tcPr>
-          <w:p>
-            <w:r>
-              <w:t>Passed</w:t>
-            </w:r>
-          </w:p>
-        </w:tc>
-        <w:tc>
-          <w:tcPr>
-            <w:tcW w:w="2400" w:type="dxa"/>
-          </w:tcPr>
-          <w:p>
-            <w:r>
-              <w:t>0.340</w:t>
+              <w:t>test_register_drone_duplicate_serial_409</w:t>
+            </w:r>
+          </w:p>
+        </w:tc>
+        <w:tc>
+          <w:tcPr>
+            <w:tcW w:w="2400" w:type="dxa"/>
+          </w:tcPr>
+          <w:p>
+            <w:r>
+              <w:t>Register drone duplicate serial 409</w:t>
+            </w:r>
+          </w:p>
+        </w:tc>
+        <w:tc>
+          <w:tcPr>
+            <w:tcW w:w="2400" w:type="dxa"/>
+          </w:tcPr>
+          <w:p>
+            <w:r>
+              <w:t>Passed</w:t>
+            </w:r>
+          </w:p>
+        </w:tc>
+        <w:tc>
+          <w:tcPr>
+            <w:tcW w:w="2400" w:type="dxa"/>
+          </w:tcPr>
+          <w:p>
+            <w:r>
+              <w:t>0.359</w:t>
             </w:r>
           </w:p>
         </w:tc>
@@ -1686,37 +1686,37 @@
           </w:tcPr>
           <w:p>
             <w:r>
-              <w:t>test_register_drone_duplicate_serial_409</w:t>
-            </w:r>
-          </w:p>
-        </w:tc>
-        <w:tc>
-          <w:tcPr>
-            <w:tcW w:w="2400" w:type="dxa"/>
-          </w:tcPr>
-          <w:p>
-            <w:r>
-              <w:t>Register drone duplicate serial 409</w:t>
-            </w:r>
-          </w:p>
-        </w:tc>
-        <w:tc>
-          <w:tcPr>
-            <w:tcW w:w="2400" w:type="dxa"/>
-          </w:tcPr>
-          <w:p>
-            <w:r>
-              <w:t>Passed</w:t>
-            </w:r>
-          </w:p>
-        </w:tc>
-        <w:tc>
-          <w:tcPr>
-            <w:tcW w:w="2400" w:type="dxa"/>
-          </w:tcPr>
-          <w:p>
-            <w:r>
-              <w:t>0.334</w:t>
+              <w:t>test_register_drone_invalid_type_404</w:t>
+            </w:r>
+          </w:p>
+        </w:tc>
+        <w:tc>
+          <w:tcPr>
+            <w:tcW w:w="2400" w:type="dxa"/>
+          </w:tcPr>
+          <w:p>
+            <w:r>
+              <w:t>Register drone invalid type 404</w:t>
+            </w:r>
+          </w:p>
+        </w:tc>
+        <w:tc>
+          <w:tcPr>
+            <w:tcW w:w="2400" w:type="dxa"/>
+          </w:tcPr>
+          <w:p>
+            <w:r>
+              <w:t>Passed</w:t>
+            </w:r>
+          </w:p>
+        </w:tc>
+        <w:tc>
+          <w:tcPr>
+            <w:tcW w:w="2400" w:type="dxa"/>
+          </w:tcPr>
+          <w:p>
+            <w:r>
+              <w:t>0.305</w:t>
             </w:r>
           </w:p>
         </w:tc>
@@ -1758,37 +1758,37 @@
           </w:tcPr>
           <w:p>
             <w:r>
-              <w:t>test_register_drone_invalid_type_404</w:t>
-            </w:r>
-          </w:p>
-        </w:tc>
-        <w:tc>
-          <w:tcPr>
-            <w:tcW w:w="2400" w:type="dxa"/>
-          </w:tcPr>
-          <w:p>
-            <w:r>
-              <w:t>Register drone invalid type 404</w:t>
-            </w:r>
-          </w:p>
-        </w:tc>
-        <w:tc>
-          <w:tcPr>
-            <w:tcW w:w="2400" w:type="dxa"/>
-          </w:tcPr>
-          <w:p>
-            <w:r>
-              <w:t>Passed</w:t>
-            </w:r>
-          </w:p>
-        </w:tc>
-        <w:tc>
-          <w:tcPr>
-            <w:tcW w:w="2400" w:type="dxa"/>
-          </w:tcPr>
-          <w:p>
-            <w:r>
-              <w:t>0.311</w:t>
+              <w:t>test_remove_drone_no_missions_200</w:t>
+            </w:r>
+          </w:p>
+        </w:tc>
+        <w:tc>
+          <w:tcPr>
+            <w:tcW w:w="2400" w:type="dxa"/>
+          </w:tcPr>
+          <w:p>
+            <w:r>
+              <w:t>Remove drone no missions 200</w:t>
+            </w:r>
+          </w:p>
+        </w:tc>
+        <w:tc>
+          <w:tcPr>
+            <w:tcW w:w="2400" w:type="dxa"/>
+          </w:tcPr>
+          <w:p>
+            <w:r>
+              <w:t>Passed</w:t>
+            </w:r>
+          </w:p>
+        </w:tc>
+        <w:tc>
+          <w:tcPr>
+            <w:tcW w:w="2400" w:type="dxa"/>
+          </w:tcPr>
+          <w:p>
+            <w:r>
+              <w:t>0.439</w:t>
             </w:r>
           </w:p>
         </w:tc>
@@ -1830,6 +1830,78 @@
           </w:tcPr>
           <w:p>
             <w:r>
+              <w:t>test_remove_drone_unassigns_referencing_missions</w:t>
+            </w:r>
+          </w:p>
+        </w:tc>
+        <w:tc>
+          <w:tcPr>
+            <w:tcW w:w="2400" w:type="dxa"/>
+          </w:tcPr>
+          <w:p>
+            <w:r>
+              <w:t>Removing a drone that a mission points to must detach the mission | (drone_instance_id -&gt; null), not block removal or delete the mission.</w:t>
+            </w:r>
+          </w:p>
+        </w:tc>
+        <w:tc>
+          <w:tcPr>
+            <w:tcW w:w="2400" w:type="dxa"/>
+          </w:tcPr>
+          <w:p>
+            <w:r>
+              <w:t>Passed</w:t>
+            </w:r>
+          </w:p>
+        </w:tc>
+        <w:tc>
+          <w:tcPr>
+            <w:tcW w:w="2400" w:type="dxa"/>
+          </w:tcPr>
+          <w:p>
+            <w:r>
+              <w:t>0.398</w:t>
+            </w:r>
+          </w:p>
+        </w:tc>
+        <w:tc>
+          <w:tcPr>
+            <w:tcW w:w="2400" w:type="dxa"/>
+          </w:tcPr>
+          <w:p>
+            <w:r>
+              <w:t>asyncio</w:t>
+            </w:r>
+          </w:p>
+        </w:tc>
+        <w:tc>
+          <w:tcPr>
+            <w:tcW w:w="2400" w:type="dxa"/>
+          </w:tcPr>
+          <w:p>
+            <w:r>
+              <w:t>-</w:t>
+            </w:r>
+          </w:p>
+        </w:tc>
+      </w:tr>
+      <w:tr>
+        <w:tc>
+          <w:tcPr>
+            <w:tcW w:w="2400" w:type="dxa"/>
+          </w:tcPr>
+          <w:p>
+            <w:r>
+              <w:t>23</w:t>
+            </w:r>
+          </w:p>
+        </w:tc>
+        <w:tc>
+          <w:tcPr>
+            <w:tcW w:w="2400" w:type="dxa"/>
+          </w:tcPr>
+          <w:p>
+            <w:r>
               <w:t>test_update_drone_notes_200</w:t>
             </w:r>
           </w:p>
@@ -1860,39 +1932,39 @@
           </w:tcPr>
           <w:p>
             <w:r>
-              <w:t>0.385</w:t>
-            </w:r>
-          </w:p>
-        </w:tc>
-        <w:tc>
-          <w:tcPr>
-            <w:tcW w:w="2400" w:type="dxa"/>
-          </w:tcPr>
-          <w:p>
-            <w:r>
-              <w:t>asyncio</w:t>
-            </w:r>
-          </w:p>
-        </w:tc>
-        <w:tc>
-          <w:tcPr>
-            <w:tcW w:w="2400" w:type="dxa"/>
-          </w:tcPr>
-          <w:p>
-            <w:r>
-              <w:t>-</w:t>
-            </w:r>
-          </w:p>
-        </w:tc>
-      </w:tr>
-      <w:tr>
-        <w:tc>
-          <w:tcPr>
-            <w:tcW w:w="2400" w:type="dxa"/>
-          </w:tcPr>
-          <w:p>
-            <w:r>
-              <w:t>23</w:t>
+              <w:t>0.509</w:t>
+            </w:r>
+          </w:p>
+        </w:tc>
+        <w:tc>
+          <w:tcPr>
+            <w:tcW w:w="2400" w:type="dxa"/>
+          </w:tcPr>
+          <w:p>
+            <w:r>
+              <w:t>asyncio</w:t>
+            </w:r>
+          </w:p>
+        </w:tc>
+        <w:tc>
+          <w:tcPr>
+            <w:tcW w:w="2400" w:type="dxa"/>
+          </w:tcPr>
+          <w:p>
+            <w:r>
+              <w:t>-</w:t>
+            </w:r>
+          </w:p>
+        </w:tc>
+      </w:tr>
+      <w:tr>
+        <w:tc>
+          <w:tcPr>
+            <w:tcW w:w="2400" w:type="dxa"/>
+          </w:tcPr>
+          <w:p>
+            <w:r>
+              <w:t>24</w:t>
             </w:r>
           </w:p>
         </w:tc>
@@ -1932,7 +2004,7 @@
           </w:tcPr>
           <w:p>
             <w:r>
-              <w:t>0.622</w:t>
+              <w:t>1.097</w:t>
             </w:r>
           </w:p>
         </w:tc>

</xml_diff>